<commit_message>
95% success, only two placeholders should be resolved.
</commit_message>
<xml_diff>
--- a/output/filled_template.docx
+++ b/output/filled_template.docx
@@ -14,7 +14,14 @@
           <w:u w:val="single"/>
         </w:rPr>
       </w:pPr>
-      <w:r/>
+      <w:r>
+        <w:rPr>
+          <w:b/>
+          <w:sz w:val="21"/>
+          <w:szCs w:val="21"/>
+          <w:u w:val="single"/>
+        </w:rPr>
+      </w:r>
     </w:p>
     <w:p>
       <w:pPr>
@@ -27,7 +34,14 @@
           <w:u w:val="single"/>
         </w:rPr>
       </w:pPr>
-      <w:r/>
+      <w:r>
+        <w:rPr>
+          <w:b/>
+          <w:sz w:val="21"/>
+          <w:szCs w:val="21"/>
+          <w:u w:val="single"/>
+        </w:rPr>
+      </w:r>
     </w:p>
     <w:p>
       <w:pPr>
@@ -37,7 +51,12 @@
           <w:szCs w:val="21"/>
         </w:rPr>
       </w:pPr>
-      <w:r/>
+      <w:r>
+        <w:rPr>
+          <w:sz w:val="21"/>
+          <w:szCs w:val="21"/>
+        </w:rPr>
+      </w:r>
     </w:p>
     <w:p>
       <w:pPr>
@@ -47,7 +66,12 @@
           <w:szCs w:val="21"/>
         </w:rPr>
       </w:pPr>
-      <w:r/>
+      <w:r>
+        <w:rPr>
+          <w:sz w:val="21"/>
+          <w:szCs w:val="21"/>
+        </w:rPr>
+      </w:r>
     </w:p>
     <w:p>
       <w:pPr>
@@ -62,6 +86,12 @@
         </w:rPr>
       </w:pPr>
       <w:r>
+        <w:rPr>
+          <w:b/>
+          <w:sz w:val="21"/>
+          <w:szCs w:val="21"/>
+          <w:u w:val="single"/>
+        </w:rPr>
         <w:t>Summary of Credit Agreement and Loan Documents</w:t>
       </w:r>
     </w:p>
@@ -74,7 +104,71 @@
         </w:rPr>
       </w:pPr>
       <w:r>
-        <w:t xml:space="preserve">Reference is hereby made to the $60,000,000 revolving line of credit (as may be increased from time to time, the “Facility”) pursuant to that certain Senior Secured Revolving Credit Facility (the “Credit Agreement” or “CA”) dated as of &lt;&lt;&lt; Effective_date &gt;&gt;&gt;, by and among </w:t>
+        <w:rPr>
+          <w:sz w:val="21"/>
+          <w:szCs w:val="21"/>
+        </w:rPr>
+        <w:t xml:space="preserve">Reference is hereby made to the </w:t>
+      </w:r>
+      <w:r>
+        <w:rPr>
+          <w:rStyle w:val="StrongEmphasis"/>
+          <w:sz w:val="21"/>
+          <w:szCs w:val="21"/>
+        </w:rPr>
+        <w:t>$60,000,000</w:t>
+      </w:r>
+      <w:r>
+        <w:rPr>
+          <w:sz w:val="21"/>
+          <w:szCs w:val="21"/>
+        </w:rPr>
+        <w:t xml:space="preserve"> revolving line of credit (as may be increased from time to time, the “</w:t>
+      </w:r>
+      <w:r>
+        <w:rPr>
+          <w:sz w:val="21"/>
+          <w:szCs w:val="21"/>
+          <w:u w:val="single"/>
+        </w:rPr>
+        <w:t>Facility</w:t>
+      </w:r>
+      <w:r>
+        <w:rPr>
+          <w:sz w:val="21"/>
+          <w:szCs w:val="21"/>
+        </w:rPr>
+        <w:t>”) pursuant to that certain Senior Secured Revolving Credit Agreement (the “</w:t>
+      </w:r>
+      <w:r>
+        <w:rPr>
+          <w:sz w:val="21"/>
+          <w:szCs w:val="21"/>
+          <w:u w:val="single"/>
+        </w:rPr>
+        <w:t>Credit Agreement</w:t>
+      </w:r>
+      <w:r>
+        <w:rPr>
+          <w:sz w:val="21"/>
+          <w:szCs w:val="21"/>
+        </w:rPr>
+        <w:t>” or “</w:t>
+      </w:r>
+      <w:r>
+        <w:rPr>
+          <w:sz w:val="21"/>
+          <w:szCs w:val="21"/>
+          <w:u w:val="single"/>
+        </w:rPr>
+        <w:t>CA</w:t>
+      </w:r>
+      <w:r>
+        <w:rPr>
+          <w:sz w:val="21"/>
+          <w:szCs w:val="21"/>
+        </w:rPr>
+        <w:t xml:space="preserve">”) dated as of December 19, 2022, by and among </w:t>
       </w:r>
     </w:p>
     <w:p>
@@ -93,7 +187,26 @@
         </w:rPr>
       </w:pPr>
       <w:r>
-        <w:t>&lt;&lt; borrower_name &gt;&gt;, (the “Borrower”)</w:t>
+        <w:rPr>
+          <w:sz w:val="21"/>
+          <w:szCs w:val="21"/>
+        </w:rPr>
+        <w:t>PENNANTPARK CREDIT OPPORTUNITIES FUND IV AGGREGATOR, LP, (the “</w:t>
+      </w:r>
+      <w:r>
+        <w:rPr>
+          <w:sz w:val="21"/>
+          <w:szCs w:val="21"/>
+          <w:u w:val="single"/>
+        </w:rPr>
+        <w:t>Borrower</w:t>
+      </w:r>
+      <w:r>
+        <w:rPr>
+          <w:sz w:val="21"/>
+          <w:szCs w:val="21"/>
+        </w:rPr>
+        <w:t>”)</w:t>
       </w:r>
     </w:p>
     <w:p>
@@ -112,7 +225,26 @@
         </w:rPr>
       </w:pPr>
       <w:r>
-        <w:t>&lt;&lt; general_partner_name &gt;&gt;, (the “General Partner”)</w:t>
+        <w:rPr>
+          <w:sz w:val="21"/>
+          <w:szCs w:val="21"/>
+        </w:rPr>
+        <w:t>PENNANTPARK CAPITAL GP IV, LLC, (the “</w:t>
+      </w:r>
+      <w:r>
+        <w:rPr>
+          <w:sz w:val="21"/>
+          <w:szCs w:val="21"/>
+          <w:u w:val="single"/>
+        </w:rPr>
+        <w:t>General Partner</w:t>
+      </w:r>
+      <w:r>
+        <w:rPr>
+          <w:sz w:val="21"/>
+          <w:szCs w:val="21"/>
+        </w:rPr>
+        <w:t>”)</w:t>
       </w:r>
     </w:p>
     <w:p>
@@ -131,7 +263,41 @@
         </w:rPr>
       </w:pPr>
       <w:r>
-        <w:t>Each financial institution that from time to time is a “Lender” thereunder (collectively, the “Lenders” and each, a “Lender”), and</w:t>
+        <w:rPr>
+          <w:sz w:val="21"/>
+          <w:szCs w:val="21"/>
+        </w:rPr>
+        <w:t>Each financial institution that from time to time is a “Lender” thereunder (collectively, the “</w:t>
+      </w:r>
+      <w:r>
+        <w:rPr>
+          <w:sz w:val="21"/>
+          <w:szCs w:val="21"/>
+          <w:u w:val="single"/>
+        </w:rPr>
+        <w:t>Lenders</w:t>
+      </w:r>
+      <w:r>
+        <w:rPr>
+          <w:sz w:val="21"/>
+          <w:szCs w:val="21"/>
+        </w:rPr>
+        <w:t>” and each, a “</w:t>
+      </w:r>
+      <w:r>
+        <w:rPr>
+          <w:sz w:val="21"/>
+          <w:szCs w:val="21"/>
+          <w:u w:val="single"/>
+        </w:rPr>
+        <w:t>Lender</w:t>
+      </w:r>
+      <w:r>
+        <w:rPr>
+          <w:sz w:val="21"/>
+          <w:szCs w:val="21"/>
+        </w:rPr>
+        <w:t>”), and</w:t>
       </w:r>
     </w:p>
     <w:p>
@@ -150,7 +316,40 @@
         </w:rPr>
       </w:pPr>
       <w:r>
-        <w:t xml:space="preserve">ING Capital LLC, in its capacity as administrative agent for the Lenders (“Administrative Agent”).  </w:t>
+        <w:rPr>
+          <w:rFonts w:ascii="var ds-font-family-code" w:hAnsi="var ds-font-family-code"/>
+          <w:b w:val="false"/>
+          <w:i w:val="false"/>
+          <w:caps w:val="false"/>
+          <w:smallCaps w:val="false"/>
+          <w:color w:val="414042" w:themeColor="text1"/>
+          <w:spacing w:val="0"/>
+          <w:sz w:val="20"/>
+          <w:szCs w:val="20"/>
+        </w:rPr>
+        <w:t>ING CAPITAL LLC</w:t>
+      </w:r>
+      <w:r>
+        <w:rPr>
+          <w:sz w:val="21"/>
+          <w:szCs w:val="21"/>
+        </w:rPr>
+        <w:t>, in its capacity as administrative agent for the Lenders (“</w:t>
+      </w:r>
+      <w:r>
+        <w:rPr>
+          <w:sz w:val="21"/>
+          <w:szCs w:val="21"/>
+          <w:u w:val="single"/>
+        </w:rPr>
+        <w:t>Administrative Agent</w:t>
+      </w:r>
+      <w:r>
+        <w:rPr>
+          <w:sz w:val="21"/>
+          <w:szCs w:val="21"/>
+        </w:rPr>
+        <w:t xml:space="preserve">”).  </w:t>
       </w:r>
     </w:p>
     <w:p>
@@ -164,7 +363,12 @@
           <w:szCs w:val="21"/>
         </w:rPr>
       </w:pPr>
-      <w:r/>
+      <w:r>
+        <w:rPr>
+          <w:sz w:val="21"/>
+          <w:szCs w:val="21"/>
+        </w:rPr>
+      </w:r>
     </w:p>
     <w:p>
       <w:pPr>
@@ -174,7 +378,12 @@
           <w:szCs w:val="21"/>
         </w:rPr>
       </w:pPr>
-      <w:r/>
+      <w:r>
+        <w:rPr>
+          <w:sz w:val="21"/>
+          <w:szCs w:val="21"/>
+        </w:rPr>
+      </w:r>
     </w:p>
     <w:tbl>
       <w:tblPr>
@@ -207,7 +416,28 @@
             </w:tcBorders>
           </w:tcPr>
           <w:p>
+            <w:pPr>
+              <w:pStyle w:val="Normal"/>
+              <w:widowControl w:val="false"/>
+              <w:spacing w:before="0" w:after="240"/>
+              <w:contextualSpacing/>
+              <w:rPr>
+                <w:b/>
+                <w:b/>
+                <w:bCs/>
+                <w:color w:val="414042" w:themeColor="text1"/>
+                <w:sz w:val="20"/>
+                <w:szCs w:val="20"/>
+              </w:rPr>
+            </w:pPr>
             <w:r>
+              <w:rPr>
+                <w:b/>
+                <w:bCs/>
+                <w:color w:val="414042" w:themeColor="text1"/>
+                <w:sz w:val="20"/>
+                <w:szCs w:val="20"/>
+              </w:rPr>
               <w:t>Facility Type</w:t>
             </w:r>
           </w:p>
@@ -223,8 +453,24 @@
             </w:tcBorders>
           </w:tcPr>
           <w:p>
+            <w:pPr>
+              <w:pStyle w:val="Normal"/>
+              <w:widowControl w:val="false"/>
+              <w:spacing w:before="0" w:after="240"/>
+              <w:contextualSpacing/>
+              <w:rPr>
+                <w:color w:val="414042" w:themeColor="text1"/>
+                <w:sz w:val="20"/>
+                <w:szCs w:val="20"/>
+              </w:rPr>
+            </w:pPr>
             <w:r>
-              <w:t>Senior Secured Revolving Credit Facility</w:t>
+              <w:rPr>
+                <w:color w:val="414042" w:themeColor="text1"/>
+                <w:sz w:val="20"/>
+                <w:szCs w:val="20"/>
+              </w:rPr>
+              <w:t>Senior Secured Revolving Credit Agreement</w:t>
             </w:r>
           </w:p>
         </w:tc>
@@ -242,7 +488,28 @@
             </w:tcBorders>
           </w:tcPr>
           <w:p>
+            <w:pPr>
+              <w:pStyle w:val="Normal"/>
+              <w:widowControl w:val="false"/>
+              <w:spacing w:before="0" w:after="240"/>
+              <w:contextualSpacing/>
+              <w:rPr>
+                <w:b/>
+                <w:b/>
+                <w:bCs/>
+                <w:color w:val="414042" w:themeColor="text1"/>
+                <w:sz w:val="20"/>
+                <w:szCs w:val="20"/>
+              </w:rPr>
+            </w:pPr>
             <w:r>
+              <w:rPr>
+                <w:b/>
+                <w:bCs/>
+                <w:color w:val="414042" w:themeColor="text1"/>
+                <w:sz w:val="20"/>
+                <w:szCs w:val="20"/>
+              </w:rPr>
               <w:t>Administrative Agent</w:t>
             </w:r>
           </w:p>
@@ -258,8 +525,30 @@
             </w:tcBorders>
           </w:tcPr>
           <w:p>
+            <w:pPr>
+              <w:pStyle w:val="PreformattedText"/>
+              <w:widowControl w:val="false"/>
+              <w:spacing w:before="0" w:after="240"/>
+              <w:contextualSpacing/>
+              <w:rPr>
+                <w:color w:val="414042" w:themeColor="text1"/>
+                <w:sz w:val="20"/>
+                <w:szCs w:val="20"/>
+              </w:rPr>
+            </w:pPr>
             <w:r>
-              <w:t>ING Capital LLC</w:t>
+              <w:rPr>
+                <w:rFonts w:ascii="var ds-font-family-code" w:hAnsi="var ds-font-family-code"/>
+                <w:b w:val="false"/>
+                <w:i w:val="false"/>
+                <w:caps w:val="false"/>
+                <w:smallCaps w:val="false"/>
+                <w:color w:val="414042" w:themeColor="text1"/>
+                <w:spacing w:val="0"/>
+                <w:sz w:val="20"/>
+                <w:szCs w:val="20"/>
+              </w:rPr>
+              <w:t>ING CAPITAL LLC</w:t>
             </w:r>
           </w:p>
         </w:tc>
@@ -277,7 +566,28 @@
             </w:tcBorders>
           </w:tcPr>
           <w:p>
+            <w:pPr>
+              <w:pStyle w:val="Normal"/>
+              <w:widowControl w:val="false"/>
+              <w:spacing w:before="0" w:after="240"/>
+              <w:contextualSpacing/>
+              <w:rPr>
+                <w:b/>
+                <w:b/>
+                <w:bCs/>
+                <w:color w:val="414042" w:themeColor="text1"/>
+                <w:sz w:val="20"/>
+                <w:szCs w:val="20"/>
+              </w:rPr>
+            </w:pPr>
             <w:r>
+              <w:rPr>
+                <w:b/>
+                <w:bCs/>
+                <w:color w:val="414042" w:themeColor="text1"/>
+                <w:sz w:val="20"/>
+                <w:szCs w:val="20"/>
+              </w:rPr>
               <w:t>Lenders as of Effective Date</w:t>
             </w:r>
           </w:p>
@@ -293,8 +603,30 @@
             </w:tcBorders>
           </w:tcPr>
           <w:p>
+            <w:pPr>
+              <w:pStyle w:val="PreformattedText"/>
+              <w:widowControl w:val="false"/>
+              <w:spacing w:before="0" w:after="240"/>
+              <w:contextualSpacing/>
+              <w:rPr>
+                <w:color w:val="414042" w:themeColor="text1"/>
+                <w:sz w:val="20"/>
+                <w:szCs w:val="20"/>
+              </w:rPr>
+            </w:pPr>
             <w:r>
-              <w:t>ING Capital LLC</w:t>
+              <w:rPr>
+                <w:rFonts w:ascii="var ds-font-family-code" w:hAnsi="var ds-font-family-code"/>
+                <w:b w:val="false"/>
+                <w:i w:val="false"/>
+                <w:caps w:val="false"/>
+                <w:smallCaps w:val="false"/>
+                <w:color w:val="414042" w:themeColor="text1"/>
+                <w:spacing w:val="0"/>
+                <w:sz w:val="20"/>
+                <w:szCs w:val="20"/>
+              </w:rPr>
+              <w:t>ING CAPITAL LLC</w:t>
             </w:r>
           </w:p>
         </w:tc>
@@ -312,7 +644,28 @@
             </w:tcBorders>
           </w:tcPr>
           <w:p>
+            <w:pPr>
+              <w:pStyle w:val="Normal"/>
+              <w:widowControl w:val="false"/>
+              <w:spacing w:before="0" w:after="240"/>
+              <w:contextualSpacing/>
+              <w:rPr>
+                <w:b/>
+                <w:b/>
+                <w:bCs/>
+                <w:color w:val="414042" w:themeColor="text1"/>
+                <w:sz w:val="20"/>
+                <w:szCs w:val="20"/>
+              </w:rPr>
+            </w:pPr>
             <w:r>
+              <w:rPr>
+                <w:b/>
+                <w:bCs/>
+                <w:color w:val="414042" w:themeColor="text1"/>
+                <w:sz w:val="20"/>
+                <w:szCs w:val="20"/>
+              </w:rPr>
               <w:t>Facility Maturity</w:t>
             </w:r>
           </w:p>
@@ -328,7 +681,23 @@
             </w:tcBorders>
           </w:tcPr>
           <w:p>
+            <w:pPr>
+              <w:pStyle w:val="Normal"/>
+              <w:widowControl w:val="false"/>
+              <w:spacing w:before="0" w:after="240"/>
+              <w:contextualSpacing/>
+              <w:rPr>
+                <w:color w:val="414042" w:themeColor="text1"/>
+                <w:sz w:val="20"/>
+                <w:szCs w:val="20"/>
+              </w:rPr>
+            </w:pPr>
             <w:r>
+              <w:rPr>
+                <w:color w:val="414042" w:themeColor="text1"/>
+                <w:sz w:val="20"/>
+                <w:szCs w:val="20"/>
+              </w:rPr>
               <w:t>December 17, 2027</w:t>
             </w:r>
           </w:p>
@@ -347,7 +716,28 @@
             </w:tcBorders>
           </w:tcPr>
           <w:p>
+            <w:pPr>
+              <w:pStyle w:val="Normal"/>
+              <w:widowControl w:val="false"/>
+              <w:spacing w:before="0" w:after="240"/>
+              <w:contextualSpacing/>
+              <w:rPr>
+                <w:b/>
+                <w:b/>
+                <w:bCs/>
+                <w:color w:val="414042" w:themeColor="text1"/>
+                <w:sz w:val="20"/>
+                <w:szCs w:val="20"/>
+              </w:rPr>
+            </w:pPr>
             <w:r>
+              <w:rPr>
+                <w:b/>
+                <w:bCs/>
+                <w:color w:val="414042" w:themeColor="text1"/>
+                <w:sz w:val="20"/>
+                <w:szCs w:val="20"/>
+              </w:rPr>
               <w:t>Commitment Termination Date</w:t>
             </w:r>
           </w:p>
@@ -363,7 +753,24 @@
             </w:tcBorders>
           </w:tcPr>
           <w:p>
+            <w:pPr>
+              <w:pStyle w:val="TextBody"/>
+              <w:widowControl w:val="false"/>
+              <w:spacing w:before="0" w:after="240"/>
+              <w:contextualSpacing/>
+              <w:rPr>
+                <w:color w:val="414042" w:themeColor="text1"/>
+                <w:sz w:val="20"/>
+                <w:szCs w:val="20"/>
+              </w:rPr>
+            </w:pPr>
             <w:r>
+              <w:rPr>
+                <w:rStyle w:val="SourceText"/>
+                <w:color w:val="414042" w:themeColor="text1"/>
+                <w:sz w:val="20"/>
+                <w:szCs w:val="20"/>
+              </w:rPr>
               <w:t>No later than December 22, 2026</w:t>
             </w:r>
           </w:p>
@@ -382,7 +789,28 @@
             </w:tcBorders>
           </w:tcPr>
           <w:p>
+            <w:pPr>
+              <w:pStyle w:val="Normal"/>
+              <w:widowControl w:val="false"/>
+              <w:spacing w:before="0" w:after="240"/>
+              <w:contextualSpacing/>
+              <w:rPr>
+                <w:b/>
+                <w:b/>
+                <w:bCs/>
+                <w:color w:val="414042" w:themeColor="text1"/>
+                <w:sz w:val="20"/>
+                <w:szCs w:val="20"/>
+              </w:rPr>
+            </w:pPr>
             <w:r>
+              <w:rPr>
+                <w:b/>
+                <w:bCs/>
+                <w:color w:val="414042" w:themeColor="text1"/>
+                <w:sz w:val="20"/>
+                <w:szCs w:val="20"/>
+              </w:rPr>
               <w:t>Facility Size</w:t>
             </w:r>
           </w:p>
@@ -398,8 +826,43 @@
             </w:tcBorders>
           </w:tcPr>
           <w:p>
+            <w:pPr>
+              <w:pStyle w:val="PreformattedText"/>
+              <w:widowControl w:val="false"/>
+              <w:spacing w:before="0" w:after="240"/>
+              <w:contextualSpacing/>
+              <w:rPr>
+                <w:color w:val="414042" w:themeColor="text1"/>
+                <w:sz w:val="20"/>
+                <w:szCs w:val="20"/>
+              </w:rPr>
+            </w:pPr>
             <w:r>
-              <w:t>$60,000,000 (increasable to $350,000,000 pursuant to §2.06(f))</w:t>
+              <w:rPr>
+                <w:rStyle w:val="SourceText"/>
+                <w:color w:val="414042" w:themeColor="text1"/>
+                <w:sz w:val="20"/>
+                <w:szCs w:val="20"/>
+              </w:rPr>
+              <w:t>&lt;&lt;</w:t>
+            </w:r>
+            <w:r>
+              <w:rPr>
+                <w:rStyle w:val="StrongEmphasis"/>
+                <w:color w:val="414042" w:themeColor="text1"/>
+                <w:sz w:val="21"/>
+                <w:szCs w:val="21"/>
+              </w:rPr>
+              <w:t>Facility_amount</w:t>
+            </w:r>
+            <w:r>
+              <w:rPr>
+                <w:rStyle w:val="SourceText"/>
+                <w:color w:val="414042" w:themeColor="text1"/>
+                <w:sz w:val="20"/>
+                <w:szCs w:val="20"/>
+              </w:rPr>
+              <w:t>&gt;&gt; (increasable to $350,000,000 pursuant to §2.06(f))</w:t>
             </w:r>
           </w:p>
         </w:tc>
@@ -417,7 +880,28 @@
             </w:tcBorders>
           </w:tcPr>
           <w:p>
+            <w:pPr>
+              <w:pStyle w:val="Normal"/>
+              <w:widowControl w:val="false"/>
+              <w:spacing w:before="0" w:after="240"/>
+              <w:contextualSpacing/>
+              <w:rPr>
+                <w:b/>
+                <w:b/>
+                <w:bCs/>
+                <w:color w:val="414042" w:themeColor="text1"/>
+                <w:sz w:val="20"/>
+                <w:szCs w:val="20"/>
+              </w:rPr>
+            </w:pPr>
             <w:r>
+              <w:rPr>
+                <w:b/>
+                <w:bCs/>
+                <w:color w:val="414042" w:themeColor="text1"/>
+                <w:sz w:val="20"/>
+                <w:szCs w:val="20"/>
+              </w:rPr>
               <w:t>Collateral</w:t>
             </w:r>
           </w:p>
@@ -433,14 +917,106 @@
             </w:tcBorders>
           </w:tcPr>
           <w:p>
+            <w:pPr>
+              <w:pStyle w:val="Normal"/>
+              <w:widowControl w:val="false"/>
+              <w:spacing w:before="0" w:after="240"/>
+              <w:contextualSpacing/>
+              <w:rPr>
+                <w:color w:val="414042" w:themeColor="text1"/>
+                <w:sz w:val="20"/>
+                <w:szCs w:val="20"/>
+              </w:rPr>
+            </w:pPr>
             <w:r>
+              <w:rPr>
+                <w:color w:val="414042" w:themeColor="text1"/>
+                <w:sz w:val="20"/>
+                <w:szCs w:val="20"/>
+              </w:rPr>
               <w:t>Borrower and Subsidiary Guarantors: All assets</w:t>
-              <w:br/>
-              <w:br/>
-              <w:t>Intermediate Entities and General Partner: Intermediate Entities and General Partner: Standard rights to issue Capital Calls and enforce Capital Contributions to and against Investors.</w:t>
-              <w:br/>
-              <w:br/>
-              <w:t xml:space="preserve">Note that assets are pledged pursuant to a multi-tier cascading structure, whereby each Feeder/SPV pledges its Capital Call/Capital Contribution rights to the Intermediate Entity or Borrower in which it owns a limited partner or membership interest. </w:t>
+            </w:r>
+          </w:p>
+          <w:p>
+            <w:pPr>
+              <w:pStyle w:val="Normal"/>
+              <w:widowControl w:val="false"/>
+              <w:spacing w:before="0" w:after="240"/>
+              <w:contextualSpacing/>
+              <w:rPr>
+                <w:color w:val="414042" w:themeColor="text1"/>
+                <w:sz w:val="20"/>
+                <w:szCs w:val="20"/>
+              </w:rPr>
+            </w:pPr>
+            <w:r>
+              <w:rPr>
+                <w:color w:val="414042" w:themeColor="text1"/>
+                <w:sz w:val="20"/>
+                <w:szCs w:val="20"/>
+              </w:rPr>
+            </w:r>
+          </w:p>
+          <w:p>
+            <w:pPr>
+              <w:pStyle w:val="Normal"/>
+              <w:widowControl w:val="false"/>
+              <w:spacing w:before="0" w:after="240"/>
+              <w:contextualSpacing/>
+              <w:rPr>
+                <w:color w:val="414042" w:themeColor="text1"/>
+                <w:sz w:val="20"/>
+                <w:szCs w:val="20"/>
+              </w:rPr>
+            </w:pPr>
+            <w:r>
+              <w:rPr>
+                <w:color w:val="414042" w:themeColor="text1"/>
+                <w:sz w:val="20"/>
+                <w:szCs w:val="20"/>
+              </w:rPr>
+              <w:t>Intermediate Entities and General Partner: &lt;&lt;Intermediate Entities and General Partner pledge their respective interests in the Borrower and Subsidiary Guarantors as collateral.&gt;&gt;</w:t>
+            </w:r>
+          </w:p>
+          <w:p>
+            <w:pPr>
+              <w:pStyle w:val="Normal"/>
+              <w:widowControl w:val="false"/>
+              <w:spacing w:before="0" w:after="240"/>
+              <w:contextualSpacing/>
+              <w:rPr>
+                <w:color w:val="414042" w:themeColor="text1"/>
+                <w:sz w:val="20"/>
+                <w:szCs w:val="20"/>
+              </w:rPr>
+            </w:pPr>
+            <w:r>
+              <w:rPr>
+                <w:color w:val="414042" w:themeColor="text1"/>
+                <w:sz w:val="20"/>
+                <w:szCs w:val="20"/>
+              </w:rPr>
+            </w:r>
+          </w:p>
+          <w:p>
+            <w:pPr>
+              <w:pStyle w:val="Normal"/>
+              <w:widowControl w:val="false"/>
+              <w:spacing w:before="0" w:after="240"/>
+              <w:contextualSpacing/>
+              <w:rPr>
+                <w:color w:val="414042" w:themeColor="text1"/>
+                <w:sz w:val="20"/>
+                <w:szCs w:val="20"/>
+              </w:rPr>
+            </w:pPr>
+            <w:r>
+              <w:rPr>
+                <w:color w:val="414042" w:themeColor="text1"/>
+                <w:sz w:val="20"/>
+                <w:szCs w:val="20"/>
+              </w:rPr>
+              <w:t xml:space="preserve">Note that assets are pledged pursuant to a multi-tier cascading structure, whereby each Feeder/SPV pledges its Capital Call/Capital Contribution rights to the Intermediate Entity or Borrower in which it owns a limited partner or membership interest. In addition, the SPV and Borrower each pledge their rights as “secured party”/”pledgee” under the Security Documents to the Borrower or the Collateral Agent, respectively. </w:t>
             </w:r>
           </w:p>
         </w:tc>
@@ -451,7 +1027,9 @@
         <w:pStyle w:val="Normal"/>
         <w:rPr/>
       </w:pPr>
-      <w:r/>
+      <w:r>
+        <w:rPr/>
+      </w:r>
     </w:p>
     <w:p>
       <w:pPr>
@@ -464,7 +1042,13 @@
           <w:u w:val="single"/>
         </w:rPr>
       </w:pPr>
-      <w:r/>
+      <w:r>
+        <w:rPr>
+          <w:b/>
+          <w:bCs/>
+          <w:u w:val="single"/>
+        </w:rPr>
+      </w:r>
     </w:p>
     <w:p>
       <w:pPr>
@@ -477,7 +1061,13 @@
           <w:u w:val="single"/>
         </w:rPr>
       </w:pPr>
-      <w:r/>
+      <w:r>
+        <w:rPr>
+          <w:b/>
+          <w:bCs/>
+          <w:u w:val="single"/>
+        </w:rPr>
+      </w:r>
     </w:p>
     <w:p>
       <w:pPr>
@@ -491,6 +1081,10 @@
         </w:rPr>
       </w:pPr>
       <w:r>
+        <w:rPr>
+          <w:b/>
+          <w:bCs/>
+        </w:rPr>
         <w:t xml:space="preserve">. </w:t>
         <w:tab/>
       </w:r>
@@ -508,7 +1102,9 @@
           <w:u w:val="single"/>
         </w:rPr>
       </w:pPr>
-      <w:r/>
+      <w:r>
+        <w:rPr/>
+      </w:r>
     </w:p>
     <w:sectPr>
       <w:headerReference w:type="even" r:id="rId2"/>

</xml_diff>

<commit_message>
99% success. facility amount alone should be cleared.
</commit_message>
<xml_diff>
--- a/output/filled_template.docx
+++ b/output/filled_template.docx
@@ -771,7 +771,7 @@
                 <w:sz w:val="20"/>
                 <w:szCs w:val="20"/>
               </w:rPr>
-              <w:t>No later than December 22, 2026</w:t>
+              <w:t>December 22, 2026</w:t>
             </w:r>
           </w:p>
         </w:tc>
@@ -975,7 +975,7 @@
                 <w:sz w:val="20"/>
                 <w:szCs w:val="20"/>
               </w:rPr>
-              <w:t>Intermediate Entities and General Partner: &lt;&lt;Intermediate Entities and General Partner pledge their respective interests in the Borrower and Subsidiary Guarantors as collateral.&gt;&gt;</w:t>
+              <w:t>Intermediate Entities and General Partner: Standard rights to issue Capital Calls and enforce Capital Contributions to and against Investors.</w:t>
             </w:r>
           </w:p>
           <w:p>

</xml_diff>

<commit_message>
99.9% success, only spelling is shorthanded. other than that everything replaced exactly what we expected.
</commit_message>
<xml_diff>
--- a/output/filled_template.docx
+++ b/output/filled_template.docx
@@ -108,7 +108,7 @@
           <w:sz w:val="21"/>
           <w:szCs w:val="21"/>
         </w:rPr>
-        <w:t xml:space="preserve">Reference is hereby made to the </w:t>
+        <w:t xml:space="preserve">Reference is hereby made to the $60,000,000 revolving line of credit (as may be increased from time to time, the “Facility”) pursuant to that certain Senior Secured Revolving Credit Agreement (the “Credit Agreement” or “CA”) dated as of December 19, 2022, by and among </w:t>
       </w:r>
       <w:r>
         <w:rPr>
@@ -116,14 +116,12 @@
           <w:sz w:val="21"/>
           <w:szCs w:val="21"/>
         </w:rPr>
-        <w:t>$60,000,000</w:t>
       </w:r>
       <w:r>
         <w:rPr>
           <w:sz w:val="21"/>
           <w:szCs w:val="21"/>
         </w:rPr>
-        <w:t xml:space="preserve"> revolving line of credit (as may be increased from time to time, the “</w:t>
       </w:r>
       <w:r>
         <w:rPr>
@@ -131,14 +129,12 @@
           <w:szCs w:val="21"/>
           <w:u w:val="single"/>
         </w:rPr>
-        <w:t>Facility</w:t>
       </w:r>
       <w:r>
         <w:rPr>
           <w:sz w:val="21"/>
           <w:szCs w:val="21"/>
         </w:rPr>
-        <w:t>”) pursuant to that certain Senior Secured Revolving Credit Agreement (the “</w:t>
       </w:r>
       <w:r>
         <w:rPr>
@@ -146,14 +142,12 @@
           <w:szCs w:val="21"/>
           <w:u w:val="single"/>
         </w:rPr>
-        <w:t>Credit Agreement</w:t>
       </w:r>
       <w:r>
         <w:rPr>
           <w:sz w:val="21"/>
           <w:szCs w:val="21"/>
         </w:rPr>
-        <w:t>” or “</w:t>
       </w:r>
       <w:r>
         <w:rPr>
@@ -161,14 +155,12 @@
           <w:szCs w:val="21"/>
           <w:u w:val="single"/>
         </w:rPr>
-        <w:t>CA</w:t>
       </w:r>
       <w:r>
         <w:rPr>
           <w:sz w:val="21"/>
           <w:szCs w:val="21"/>
         </w:rPr>
-        <w:t xml:space="preserve">”) dated as of December 19, 2022, by and among </w:t>
       </w:r>
     </w:p>
     <w:p>
@@ -191,7 +183,7 @@
           <w:sz w:val="21"/>
           <w:szCs w:val="21"/>
         </w:rPr>
-        <w:t>PENNANTPARK CREDIT OPPORTUNITIES FUND IV AGGREGATOR, LP, (the “</w:t>
+        <w:t>PENNANTPARK CREDIT OPPORTUNITIES FUND IV AGGREGATOR, LP, (the “Borrower”)</w:t>
       </w:r>
       <w:r>
         <w:rPr>
@@ -199,14 +191,12 @@
           <w:szCs w:val="21"/>
           <w:u w:val="single"/>
         </w:rPr>
-        <w:t>Borrower</w:t>
       </w:r>
       <w:r>
         <w:rPr>
           <w:sz w:val="21"/>
           <w:szCs w:val="21"/>
         </w:rPr>
-        <w:t>”)</w:t>
       </w:r>
     </w:p>
     <w:p>
@@ -229,7 +219,7 @@
           <w:sz w:val="21"/>
           <w:szCs w:val="21"/>
         </w:rPr>
-        <w:t>PENNANTPARK CAPITAL GP IV, LLC, (the “</w:t>
+        <w:t>PENNANTPARK CAPITAL GP IV, LLC, (the “General Partner”)</w:t>
       </w:r>
       <w:r>
         <w:rPr>
@@ -237,14 +227,12 @@
           <w:szCs w:val="21"/>
           <w:u w:val="single"/>
         </w:rPr>
-        <w:t>General Partner</w:t>
       </w:r>
       <w:r>
         <w:rPr>
           <w:sz w:val="21"/>
           <w:szCs w:val="21"/>
         </w:rPr>
-        <w:t>”)</w:t>
       </w:r>
     </w:p>
     <w:p>
@@ -327,14 +315,13 @@
           <w:sz w:val="20"/>
           <w:szCs w:val="20"/>
         </w:rPr>
-        <w:t>ING CAPITAL LLC</w:t>
+        <w:t xml:space="preserve">ING CAPITAL LLC, in its capacity as administrative agent for the Lenders (“Administrative Agent”).  </w:t>
       </w:r>
       <w:r>
         <w:rPr>
           <w:sz w:val="21"/>
           <w:szCs w:val="21"/>
         </w:rPr>
-        <w:t>, in its capacity as administrative agent for the Lenders (“</w:t>
       </w:r>
       <w:r>
         <w:rPr>
@@ -342,14 +329,12 @@
           <w:szCs w:val="21"/>
           <w:u w:val="single"/>
         </w:rPr>
-        <w:t>Administrative Agent</w:t>
       </w:r>
       <w:r>
         <w:rPr>
           <w:sz w:val="21"/>
           <w:szCs w:val="21"/>
         </w:rPr>
-        <w:t xml:space="preserve">”).  </w:t>
       </w:r>
     </w:p>
     <w:p>
@@ -771,7 +756,7 @@
                 <w:sz w:val="20"/>
                 <w:szCs w:val="20"/>
               </w:rPr>
-              <w:t>December 22, 2026</w:t>
+              <w:t>No later than December 22, 2026</w:t>
             </w:r>
           </w:p>
         </w:tc>
@@ -844,7 +829,7 @@
                 <w:sz w:val="20"/>
                 <w:szCs w:val="20"/>
               </w:rPr>
-              <w:t>&lt;&lt;</w:t>
+              <w:t>$60,000,000 (increasable to $350,000,000 pursuant to §2.06(f))</w:t>
             </w:r>
             <w:r>
               <w:rPr>
@@ -853,7 +838,6 @@
                 <w:sz w:val="21"/>
                 <w:szCs w:val="21"/>
               </w:rPr>
-              <w:t>Facility_amount</w:t>
             </w:r>
             <w:r>
               <w:rPr>
@@ -862,7 +846,6 @@
                 <w:sz w:val="20"/>
                 <w:szCs w:val="20"/>
               </w:rPr>
-              <w:t>&gt;&gt; (increasable to $350,000,000 pursuant to §2.06(f))</w:t>
             </w:r>
           </w:p>
         </w:tc>

</xml_diff>

<commit_message>
Changed open ai to Groq [free source model]
</commit_message>
<xml_diff>
--- a/output/filled_template.docx
+++ b/output/filled_template.docx
@@ -315,7 +315,7 @@
           <w:sz w:val="20"/>
           <w:szCs w:val="20"/>
         </w:rPr>
-        <w:t xml:space="preserve">ING CAPITAL LLC, in its capacity as administrative agent for the Lenders (“Administrative Agent”).  </w:t>
+        <w:t xml:space="preserve">ING Capital LLC, in its capacity as administrative agent for the Lenders (“Administrative Agent”).  </w:t>
       </w:r>
       <w:r>
         <w:rPr>
@@ -533,7 +533,7 @@
                 <w:sz w:val="20"/>
                 <w:szCs w:val="20"/>
               </w:rPr>
-              <w:t>ING CAPITAL LLC</w:t>
+              <w:t>ING Capital LLC</w:t>
             </w:r>
           </w:p>
         </w:tc>
@@ -611,7 +611,7 @@
                 <w:sz w:val="20"/>
                 <w:szCs w:val="20"/>
               </w:rPr>
-              <w:t>ING CAPITAL LLC</w:t>
+              <w:t>ING Capital LLC</w:t>
             </w:r>
           </w:p>
         </w:tc>
@@ -756,7 +756,7 @@
                 <w:sz w:val="20"/>
                 <w:szCs w:val="20"/>
               </w:rPr>
-              <w:t>No later than December 22, 2026</w:t>
+              <w:t>No later than December 22, 2026</w:t>
             </w:r>
           </w:p>
         </w:tc>
@@ -958,7 +958,7 @@
                 <w:sz w:val="20"/>
                 <w:szCs w:val="20"/>
               </w:rPr>
-              <w:t>Intermediate Entities and General Partner: Standard rights to issue Capital Calls and enforce Capital Contributions to and against Investors.</w:t>
+              <w:t>Intermediate Entities and General Partner: &lt;&lt;Intermediate Entities and General Partner pledge their respective interests in the Borrower and Subsidiary Guarantors as collateral.&gt;&gt;</w:t>
             </w:r>
           </w:p>
           <w:p>

</xml_diff>